<commit_message>
Update PDF, DOCX and factsheet with honors
</commit_message>
<xml_diff>
--- a/downloads/John_P_Williamson_Biography.docx
+++ b/downloads/John_P_Williamson_Biography.docx
@@ -577,8 +577,34 @@
         <w:rPr>
           <w:sz w:val="21"/>
         </w:rPr>
-        <w:t>; Kentucky Colonel</w:t>
-      </w:r>
+        <w:t xml:space="preserve">; Kentucky Colonel, 1980</w:t>
+      </w:r>
+      <w:hyperlink w:anchor="src-37" w:history="1">
+        <w:r>
+          <w:rPr>
+            <w:color w:val="8A6214"/>
+            <w:sz w:val="25"/>
+            <w:vertAlign w:val="superscript"/>
+          </w:rPr>
+          <w:t>37</w:t>
+        </w:r>
+      </w:hyperlink>
+      <w:r>
+        <w:rPr>
+          <w:sz w:val="21"/>
+        </w:rPr>
+        <w:t xml:space="preserve">; Kiwanis Legion of Honor, 1977</w:t>
+      </w:r>
+      <w:hyperlink w:anchor="src-37" w:history="1">
+        <w:r>
+          <w:rPr>
+            <w:color w:val="8A6214"/>
+            <w:sz w:val="25"/>
+            <w:vertAlign w:val="superscript"/>
+          </w:rPr>
+          <w:t>37</w:t>
+        </w:r>
+      </w:hyperlink>
     </w:p>
     <w:p>
       <w:pPr>
@@ -1034,6 +1060,19 @@
           <w:t>10</w:t>
         </w:r>
       </w:hyperlink>
+      <w:r>
+        <w:t xml:space="preserve"> He kept learning the business from the inside: in December 1960 the company awarded him a certificate for completing its course in Simplified Electricity.</w:t>
+      </w:r>
+      <w:hyperlink w:anchor="src-37" w:history="1">
+        <w:r>
+          <w:rPr>
+            <w:color w:val="8A6214"/>
+            <w:sz w:val="25"/>
+            <w:vertAlign w:val="superscript"/>
+          </w:rPr>
+          <w:t>37</w:t>
+        </w:r>
+      </w:hyperlink>
     </w:p>
     <w:p>
       <w:r>
@@ -1346,6 +1385,19 @@
             <w:vertAlign w:val="superscript"/>
           </w:rPr>
           <w:t>21</w:t>
+        </w:r>
+      </w:hyperlink>
+      <w:r>
+        <w:t xml:space="preserve"> In October 1972, the year he became president, he completed the American Management Association’s management course in New York, described on his certificate as “an intensive review for executives of the basic principles, skills and tools of management.”</w:t>
+      </w:r>
+      <w:hyperlink w:anchor="src-37" w:history="1">
+        <w:r>
+          <w:rPr>
+            <w:color w:val="8A6214"/>
+            <w:sz w:val="25"/>
+            <w:vertAlign w:val="superscript"/>
+          </w:rPr>
+          <w:t>37</w:t>
         </w:r>
       </w:hyperlink>
     </w:p>
@@ -1958,6 +2010,32 @@
       <w:r>
         <w:t xml:space="preserve"> He also served on the board of the Salvation Army and on a City of Toledo board.</w:t>
       </w:r>
+      <w:r>
+        <w:t xml:space="preserve"> The Toledo Area Chamber of Commerce honored him in January 1972 for “outstanding leadership” as its president in 1970 and a trustee in 1970–71, and the American National Red Cross cited his leadership of the Greater Toledo area’s 1972 fund campaign for the United Appeal, Community Chest and Red Cross.</w:t>
+      </w:r>
+      <w:hyperlink w:anchor="src-37" w:history="1">
+        <w:r>
+          <w:rPr>
+            <w:color w:val="8A6214"/>
+            <w:sz w:val="25"/>
+            <w:vertAlign w:val="superscript"/>
+          </w:rPr>
+          <w:t>37</w:t>
+        </w:r>
+      </w:hyperlink>
+      <w:r>
+        <w:t xml:space="preserve"> On Jan. 1, 1977, the Kiwanis Club of Toledo and Kiwanis International enrolled him in the Kiwanis Legion of Honor for twenty-five years as a Kiwanian.</w:t>
+      </w:r>
+      <w:hyperlink w:anchor="src-37" w:history="1">
+        <w:r>
+          <w:rPr>
+            <w:color w:val="8A6214"/>
+            <w:sz w:val="25"/>
+            <w:vertAlign w:val="superscript"/>
+          </w:rPr>
+          <w:t>37</w:t>
+        </w:r>
+      </w:hyperlink>
     </w:p>
     <w:p>
       <w:pPr>
@@ -2278,7 +2356,20 @@
     </w:p>
     <w:p>
       <w:r>
-        <w:t>In 1977 Gov. James A. Rhodes appointed him to Ohio’s Development Advisory Council. He was named Toledo Area Citizen of the Year.</w:t>
+        <w:t xml:space="preserve">Gov. James A. Rhodes appointed him to Ohio’s Development Advisory Council; his commission, signed at Columbus on March 5, 1976, ran to March 1, 1979.</w:t>
+      </w:r>
+      <w:hyperlink w:anchor="src-37" w:history="1">
+        <w:r>
+          <w:rPr>
+            <w:color w:val="8A6214"/>
+            <w:sz w:val="25"/>
+            <w:vertAlign w:val="superscript"/>
+          </w:rPr>
+          <w:t>37</w:t>
+        </w:r>
+      </w:hyperlink>
+      <w:r>
+        <w:t xml:space="preserve"> He was named Toledo Area Citizen of the Year.</w:t>
       </w:r>
       <w:hyperlink w:anchor="src-2" w:history="1">
         <w:r>
@@ -2309,8 +2400,74 @@
         </w:r>
       </w:hyperlink>
       <w:r>
-        <w:t xml:space="preserve"> He was also a Kentucky Colonel.</w:t>
-      </w:r>
+        <w:t xml:space="preserve"> On Nov. 14, 1980, Kentucky Gov. John Y. Brown Jr. commissioned him a Kentucky Colonel.</w:t>
+      </w:r>
+      <w:hyperlink w:anchor="src-37" w:history="1">
+        <w:r>
+          <w:rPr>
+            <w:color w:val="8A6214"/>
+            <w:sz w:val="25"/>
+            <w:vertAlign w:val="superscript"/>
+          </w:rPr>
+          <w:t>37</w:t>
+        </w:r>
+      </w:hyperlink>
+    </w:p>
+    <w:p>
+      <w:r>
+        <w:t xml:space="preserve">Toledo’s university and medical college thanked him, too. In November 1974 the University of Toledo’s trustees hailed him as “a true friend of the University” for his work on its Centennial Fund Campaign, and in April 1975 the Medical College of Ohio honored his part in its first capital fund campaign, “the largest such endeavor heretofore undertaken in our community.”</w:t>
+      </w:r>
+      <w:hyperlink w:anchor="src-37" w:history="1">
+        <w:r>
+          <w:rPr>
+            <w:color w:val="8A6214"/>
+            <w:sz w:val="25"/>
+            <w:vertAlign w:val="superscript"/>
+          </w:rPr>
+          <w:t>37</w:t>
+        </w:r>
+      </w:hyperlink>
+      <w:r>
+        <w:t xml:space="preserve"> Beta Alpha Psi, the national accounting fraternity, initiated him in 1969, and the University of Toledo chapter of Beta Gamma Sigma elected him a member in 1981.</w:t>
+      </w:r>
+      <w:hyperlink w:anchor="src-37" w:history="1">
+        <w:r>
+          <w:rPr>
+            <w:color w:val="8A6214"/>
+            <w:sz w:val="25"/>
+            <w:vertAlign w:val="superscript"/>
+          </w:rPr>
+          <w:t>37</w:t>
+        </w:r>
+      </w:hyperlink>
+    </w:p>
+    <w:p>
+      <w:r>
+        <w:t xml:space="preserve">Among his keepsakes is the formal invitation from the Committee for the 50th American Presidential Inaugural to the inauguration of President Ronald Reagan and Vice President George H. W. Bush in Washington on Jan. 20, 1985.</w:t>
+      </w:r>
+      <w:hyperlink w:anchor="src-37" w:history="1">
+        <w:r>
+          <w:rPr>
+            <w:color w:val="8A6214"/>
+            <w:sz w:val="25"/>
+            <w:vertAlign w:val="superscript"/>
+          </w:rPr>
+          <w:t>37</w:t>
+        </w:r>
+      </w:hyperlink>
+      <w:r>
+        <w:t xml:space="preserve"> After his death, State Rep. Michael P. Sheehy issued a memorial from the Ohio House of Representatives remembering him as “a spirited individual who contributed immeasurably to the world around him.”</w:t>
+      </w:r>
+      <w:hyperlink w:anchor="src-37" w:history="1">
+        <w:r>
+          <w:rPr>
+            <w:color w:val="8A6214"/>
+            <w:sz w:val="25"/>
+            <w:vertAlign w:val="superscript"/>
+          </w:rPr>
+          <w:t>37</w:t>
+        </w:r>
+      </w:hyperlink>
     </w:p>
     <w:p>
       <w:pPr>
@@ -2466,6 +2623,19 @@
             <w:vertAlign w:val="superscript"/>
           </w:rPr>
           <w:t>6</w:t>
+        </w:r>
+      </w:hyperlink>
+      <w:r>
+        <w:t xml:space="preserve"> A certificate the family kept confirms the University of Toledo part: on June 1, 1956, the university awarded him a Certificate of Achievement for completing a series of six courses in managerial development, conducted in cooperation with Toledo Edison.</w:t>
+      </w:r>
+      <w:hyperlink w:anchor="src-37" w:history="1">
+        <w:r>
+          <w:rPr>
+            <w:color w:val="8A6214"/>
+            <w:sz w:val="25"/>
+            <w:vertAlign w:val="superscript"/>
+          </w:rPr>
+          <w:t>37</w:t>
         </w:r>
       </w:hyperlink>
     </w:p>
@@ -2708,6 +2878,37 @@
           <w:t>30</w:t>
         </w:r>
       </w:hyperlink>
+      <w:r>
+        <w:t xml:space="preserve"> His membership certificate records that he was initiated into Delta Sigma Pi’s Beta Pi chapter on Nov. 14, 1942, and in 1975 the fraternity made him a life member.</w:t>
+      </w:r>
+      <w:hyperlink w:anchor="src-37" w:history="1">
+        <w:r>
+          <w:rPr>
+            <w:color w:val="8A6214"/>
+            <w:sz w:val="25"/>
+            <w:vertAlign w:val="superscript"/>
+          </w:rPr>
+          <w:t>37</w:t>
+        </w:r>
+      </w:hyperlink>
+      <w:r>
+        <w:rPr>
+          <w:color w:val="8A6214"/>
+          <w:sz w:val="25"/>
+          <w:vertAlign w:val="superscript"/>
+        </w:rPr>
+        <w:t>,</w:t>
+      </w:r>
+      <w:hyperlink w:anchor="src-13" w:history="1">
+        <w:r>
+          <w:rPr>
+            <w:color w:val="8A6214"/>
+            <w:sz w:val="25"/>
+            <w:vertAlign w:val="superscript"/>
+          </w:rPr>
+          <w:t>13</w:t>
+        </w:r>
+      </w:hyperlink>
     </w:p>
     <w:p>
       <w:pPr>
@@ -3104,6 +3305,34 @@
       </w:hyperlink>
     </w:p>
     <w:p>
+      <w:r>
+        <w:t xml:space="preserve">His ties to the university only deepened. In 1990, nearly half a century after his own student days, the Kent State chapter of Delta Upsilon initiated him into that fraternity.</w:t>
+      </w:r>
+      <w:hyperlink w:anchor="src-37" w:history="1">
+        <w:r>
+          <w:rPr>
+            <w:color w:val="8A6214"/>
+            <w:sz w:val="25"/>
+            <w:vertAlign w:val="superscript"/>
+          </w:rPr>
+          <w:t>37</w:t>
+        </w:r>
+      </w:hyperlink>
+      <w:r>
+        <w:t xml:space="preserve"> He served on the Kent State University Foundation’s board of directors from 1992, and on May 23, 1997, the board granted him emeritus status by unanimous resolution, thanking John and Helen for their “devoted and distinguished service” and for making possible the Williamson Alumni Center as “a permanent entry point for all 130,000 Alumni.”</w:t>
+      </w:r>
+      <w:hyperlink w:anchor="src-37" w:history="1">
+        <w:r>
+          <w:rPr>
+            <w:color w:val="8A6214"/>
+            <w:sz w:val="25"/>
+            <w:vertAlign w:val="superscript"/>
+          </w:rPr>
+          <w:t>37</w:t>
+        </w:r>
+      </w:hyperlink>
+    </w:p>
+    <w:p>
       <w:pPr>
         <w:pStyle w:val="Heading1"/>
       </w:pPr>
@@ -3173,6 +3402,21 @@
     </w:p>
     <w:p>
       <w:r>
+        <w:t xml:space="preserve">He had quieter pleasures as well: in 1983 he completed the Orvis Company’s course of instruction in fly casting, and a Certificat de Mérite from Le Comité National des Vins de France records his study of the fine wines of France.</w:t>
+      </w:r>
+      <w:hyperlink w:anchor="src-37" w:history="1">
+        <w:r>
+          <w:rPr>
+            <w:color w:val="8A6214"/>
+            <w:sz w:val="25"/>
+            <w:vertAlign w:val="superscript"/>
+          </w:rPr>
+          <w:t>37</w:t>
+        </w:r>
+      </w:hyperlink>
+    </w:p>
+    <w:p>
+      <w:r>
         <w:t>In 1996 he was qualified to serve as a Stephen Minister at Rio Verde Community Church, a quiet continuation of a lifetime of service.</w:t>
       </w:r>
     </w:p>
@@ -3691,6 +3935,22 @@
           <w:t>https://www.toledoblade.com/news/deaths/2014/10/28/John-Williamson-1922-2014-Hard-work-led-man-to-the-top-position-at-Toledo-Edison/stories/20141027201</w:t>
         </w:r>
       </w:hyperlink>
+      <w:r>
+        <w:rPr>
+          <w:sz w:val="19"/>
+        </w:rPr>
+        <w:t xml:space="preserve"> </w:t>
+      </w:r>
+      <w:hyperlink r:id="rId54" w:history="1">
+        <w:r>
+          <w:rPr>
+            <w:color w:val="1A4F9C"/>
+            <w:sz w:val="18"/>
+            <w:u w:val="single"/>
+          </w:rPr>
+          <w:t>[archived copy]</w:t>
+        </w:r>
+      </w:hyperlink>
       <w:bookmarkEnd w:id="101"/>
     </w:p>
     <w:p>
@@ -3878,6 +4138,22 @@
           <w:t>https://www.kent.edu/magazine/news/alumni-life-10</w:t>
         </w:r>
       </w:hyperlink>
+      <w:r>
+        <w:rPr>
+          <w:sz w:val="19"/>
+        </w:rPr>
+        <w:t xml:space="preserve"> </w:t>
+      </w:r>
+      <w:hyperlink r:id="rId55" w:history="1">
+        <w:r>
+          <w:rPr>
+            <w:color w:val="1A4F9C"/>
+            <w:sz w:val="18"/>
+            <w:u w:val="single"/>
+          </w:rPr>
+          <w:t>[archived copy]</w:t>
+        </w:r>
+      </w:hyperlink>
       <w:bookmarkEnd w:id="105"/>
     </w:p>
     <w:p>
@@ -4003,6 +4279,22 @@
           <w:t>https://www.findagrave.com/memorial/224691877/john-pritchard-williamson</w:t>
         </w:r>
       </w:hyperlink>
+      <w:r>
+        <w:rPr>
+          <w:sz w:val="19"/>
+        </w:rPr>
+        <w:t xml:space="preserve"> </w:t>
+      </w:r>
+      <w:hyperlink r:id="rId56" w:history="1">
+        <w:r>
+          <w:rPr>
+            <w:color w:val="1A4F9C"/>
+            <w:sz w:val="18"/>
+            <w:u w:val="single"/>
+          </w:rPr>
+          <w:t>[archived copy]</w:t>
+        </w:r>
+      </w:hyperlink>
       <w:bookmarkEnd w:id="108"/>
     </w:p>
     <w:p>
@@ -4038,6 +4330,22 @@
             <w:u w:val="single"/>
           </w:rPr>
           <w:t>https://alumninewsarchive.utoledo.edu/2015/01/29/class-notesobits-10/</w:t>
+        </w:r>
+      </w:hyperlink>
+      <w:r>
+        <w:rPr>
+          <w:sz w:val="19"/>
+        </w:rPr>
+        <w:t xml:space="preserve"> </w:t>
+      </w:r>
+      <w:hyperlink r:id="rId57" w:history="1">
+        <w:r>
+          <w:rPr>
+            <w:color w:val="1A4F9C"/>
+            <w:sz w:val="18"/>
+            <w:u w:val="single"/>
+          </w:rPr>
+          <w:t>[archived copy]</w:t>
         </w:r>
       </w:hyperlink>
       <w:bookmarkEnd w:id="109"/>
@@ -4337,6 +4645,22 @@
         </w:rPr>
         <w:t xml:space="preserve"> brochure (c. 1965–66; Advisory Committee page lists “John P. Williamson, Vice President of Finance, The Toledo Edison Company, Toledo, Ohio”). Printed document, no web link.</w:t>
       </w:r>
+      <w:r>
+        <w:rPr>
+          <w:sz w:val="19"/>
+        </w:rPr>
+        <w:t xml:space="preserve"> </w:t>
+      </w:r>
+      <w:hyperlink r:id="rId58" w:history="1">
+        <w:r>
+          <w:rPr>
+            <w:color w:val="1A4F9C"/>
+            <w:sz w:val="18"/>
+            <w:u w:val="single"/>
+          </w:rPr>
+          <w:t>[archived copy]</w:t>
+        </w:r>
+      </w:hyperlink>
       <w:bookmarkEnd w:id="116"/>
     </w:p>
     <w:p>
@@ -4374,6 +4698,22 @@
           <w:t>https://www.utoledo.edu/library/canaday/collections/findingaids1/MSS-338_AS.pdf</w:t>
         </w:r>
       </w:hyperlink>
+      <w:r>
+        <w:rPr>
+          <w:sz w:val="19"/>
+        </w:rPr>
+        <w:t xml:space="preserve"> </w:t>
+      </w:r>
+      <w:hyperlink r:id="rId59" w:history="1">
+        <w:r>
+          <w:rPr>
+            <w:color w:val="1A4F9C"/>
+            <w:sz w:val="18"/>
+            <w:u w:val="single"/>
+          </w:rPr>
+          <w:t>[archived copy]</w:t>
+        </w:r>
+      </w:hyperlink>
       <w:bookmarkEnd w:id="117"/>
     </w:p>
     <w:p>
@@ -4409,6 +4749,22 @@
             <w:u w:val="single"/>
           </w:rPr>
           <w:t>https://archive.org/details/cia-readingroom-document-cia-rdp85b01152r000600780073-9</w:t>
+        </w:r>
+      </w:hyperlink>
+      <w:r>
+        <w:rPr>
+          <w:sz w:val="19"/>
+        </w:rPr>
+        <w:t xml:space="preserve"> </w:t>
+      </w:r>
+      <w:hyperlink r:id="rId60" w:history="1">
+        <w:r>
+          <w:rPr>
+            <w:color w:val="1A4F9C"/>
+            <w:sz w:val="18"/>
+            <w:u w:val="single"/>
+          </w:rPr>
+          <w:t>[archived copy]</w:t>
         </w:r>
       </w:hyperlink>
       <w:bookmarkEnd w:id="118"/>
@@ -4535,6 +4891,22 @@
           <w:t>https://www.govinfo.gov/content/pkg/FR-1974-03-12/pdf/FR-1974-03-12.pdf</w:t>
         </w:r>
       </w:hyperlink>
+      <w:r>
+        <w:rPr>
+          <w:sz w:val="19"/>
+        </w:rPr>
+        <w:t xml:space="preserve"> </w:t>
+      </w:r>
+      <w:hyperlink r:id="rId61" w:history="1">
+        <w:r>
+          <w:rPr>
+            <w:color w:val="1A4F9C"/>
+            <w:sz w:val="18"/>
+            <w:u w:val="single"/>
+          </w:rPr>
+          <w:t>[archived copy]</w:t>
+        </w:r>
+      </w:hyperlink>
       <w:bookmarkEnd w:id="121"/>
     </w:p>
     <w:p>
@@ -4871,6 +5243,22 @@
           <w:t>https://archive.org/details/chestnutburr1944kent</w:t>
         </w:r>
       </w:hyperlink>
+      <w:r>
+        <w:rPr>
+          <w:sz w:val="19"/>
+        </w:rPr>
+        <w:t xml:space="preserve"> </w:t>
+      </w:r>
+      <w:hyperlink r:id="rId62" w:history="1">
+        <w:r>
+          <w:rPr>
+            <w:color w:val="1A4F9C"/>
+            <w:sz w:val="18"/>
+            <w:u w:val="single"/>
+          </w:rPr>
+          <w:t>[archived copy]</w:t>
+        </w:r>
+      </w:hyperlink>
       <w:bookmarkEnd w:id="129"/>
     </w:p>
     <w:p>
@@ -5002,6 +5390,22 @@
           <w:t>https://www.kent.edu/alumni-and-giving/alumni-award-categories</w:t>
         </w:r>
       </w:hyperlink>
+      <w:r>
+        <w:rPr>
+          <w:sz w:val="19"/>
+        </w:rPr>
+        <w:t xml:space="preserve"> </w:t>
+      </w:r>
+      <w:hyperlink r:id="rId63" w:history="1">
+        <w:r>
+          <w:rPr>
+            <w:color w:val="1A4F9C"/>
+            <w:sz w:val="18"/>
+            <w:u w:val="single"/>
+          </w:rPr>
+          <w:t>[archived copy]</w:t>
+        </w:r>
+      </w:hyperlink>
       <w:bookmarkEnd w:id="132"/>
     </w:p>
     <w:p>
@@ -5076,6 +5480,22 @@
           <w:t>https://www.kent.edu/alumni-and-giving/mission-and-history</w:t>
         </w:r>
       </w:hyperlink>
+      <w:r>
+        <w:rPr>
+          <w:sz w:val="19"/>
+        </w:rPr>
+        <w:t xml:space="preserve"> </w:t>
+      </w:r>
+      <w:hyperlink r:id="rId64" w:history="1">
+        <w:r>
+          <w:rPr>
+            <w:color w:val="1A4F9C"/>
+            <w:sz w:val="18"/>
+            <w:u w:val="single"/>
+          </w:rPr>
+          <w:t>[archived copy]</w:t>
+        </w:r>
+      </w:hyperlink>
       <w:bookmarkEnd w:id="134"/>
     </w:p>
     <w:p>
@@ -5111,6 +5531,22 @@
             <w:u w:val="single"/>
           </w:rPr>
           <w:t>https://www.library.kent.edu/special-collections-and-archives/carol-cartwright-papers-ksu-president</w:t>
+        </w:r>
+      </w:hyperlink>
+      <w:r>
+        <w:rPr>
+          <w:sz w:val="19"/>
+        </w:rPr>
+        <w:t xml:space="preserve"> </w:t>
+      </w:r>
+      <w:hyperlink r:id="rId65" w:history="1">
+        <w:r>
+          <w:rPr>
+            <w:color w:val="1A4F9C"/>
+            <w:sz w:val="18"/>
+            <w:u w:val="single"/>
+          </w:rPr>
+          <w:t>[archived copy]</w:t>
         </w:r>
       </w:hyperlink>
       <w:bookmarkEnd w:id="135"/>
@@ -5167,6 +5603,43 @@
     </w:p>
     <w:p>
       <w:pPr>
+        <w:spacing w:after="80" w:line="264" w:lineRule="auto"/>
+        <w:ind w:left="461" w:hanging="461"/>
+      </w:pPr>
+      <w:bookmarkStart w:id="137" w:name="src-37"/>
+      <w:r>
+        <w:rPr>
+          <w:sz w:val="19"/>
+        </w:rPr>
+        <w:t>37.</w:t>
+        <w:tab/>
+      </w:r>
+      <w:r>
+        <w:rPr>
+          <w:sz w:val="19"/>
+        </w:rPr>
+        <w:t xml:space="preserve">Williamson family collection, “The Williamson Family Collection: Honors, Certificates &amp; Distinctions,” booklet of photographed certificates, commissions and citations, 1942–1997, and an Ohio House of Representatives memorial (23 pp.; certificates include the Kentucky Colonel commission of Nov. 14, 1980, and the Ohio Development Advisory Council commission of Mar. 5, 1976). Family-held document, no web link.</w:t>
+      </w:r>
+      <w:r>
+        <w:rPr>
+          <w:sz w:val="19"/>
+        </w:rPr>
+        <w:t xml:space="preserve"> </w:t>
+      </w:r>
+      <w:hyperlink r:id="rId66" w:history="1">
+        <w:r>
+          <w:rPr>
+            <w:color w:val="1A4F9C"/>
+            <w:sz w:val="18"/>
+            <w:u w:val="single"/>
+          </w:rPr>
+          <w:t>[archived copy]</w:t>
+        </w:r>
+      </w:hyperlink>
+      <w:bookmarkEnd w:id="137"/>
+    </w:p>
+    <w:p>
+      <w:pPr>
         <w:pStyle w:val="Heading2"/>
       </w:pPr>
       <w:r>
@@ -5245,7 +5718,7 @@
           <w:color w:val="5B6475"/>
           <w:sz w:val="18"/>
         </w:rPr>
-        <w:t>Last updated October 27, 2026</w:t>
+        <w:t>Last updated October 30, 2026</w:t>
       </w:r>
     </w:p>
     <w:sectPr>

</xml_diff>